<commit_message>
Remove meta-instruction text from Chapter 1 and 2
Strips three leaked writing-aid phrases that do not belong in the
thesis text:

1. Table 2.1 intro: removed "in line with the recency criterion for
   this review" — sentence now reads naturally without the instruction
   fragment.

2. References section header note: removed the entire paragraph
   "All sources were verified against a live publisher … included as
   unavoidable origin citations for the frameworks and algorithms used."
   This was an internal writing note, not thesis content.

Co-Authored-By: Claude Sonnet 4.6 <noreply@anthropic.com>
Claude-Session: https://claude.ai/code/session_01VADmG4erFwh9AZJJyJ5yqP
</commit_message>
<xml_diff>
--- a/docs/Ofori_Prince_Chapter1_and_Chapter2.docx
+++ b/docs/Ofori_Prince_Chapter1_and_Chapter2.docx
@@ -64,8 +64,6 @@
       </w:pPr>
       <w:r>
         <w:t xml:space="preserve">Within university populations in the region, the picture is similarly mixed. Studies of West African students have found moderate levels of cybersecurity awareness with significant gaps in phishing recognition, password security and data privacy (Education and Information Technologies, 2024; IJISRT, 2025). A study of students in Enugu </w:t>
-      </w:r>
-      <w:r>
         <w:lastRenderedPageBreak/>
         <w:t>State, Nigeria, representing the closest published equivalent to the Ghanaian context, found that students relied heavily on technology for academic and personal activities while remaining substantially under-prepared to protect themselves online (IJISRT, 2025). The United Nations Development Programme launched a regional cybersecurity training programme for young people across West and Central Africa in 2025, attracting over 20,000 applications from 24 countries, with Ghana producing 1,704 applicants, confirming that the demand for cybersecurity capacity far exceeds what current educational provision delivers (UNDP, 2025).</w:t>
       </w:r>
@@ -86,8 +84,6 @@
       </w:pPr>
       <w:r>
         <w:t xml:space="preserve">Machine learning, and XGBoost (Chen &amp; Guestrin, 2016) in particular, has become a leading approach for this kind of prediction on structured tabular data. When paired with SHapley Additive Explanations (Lundberg &amp; Lee, 2017), it produces both accurate predictions and interpretable feature rankings, answering not only which students are at risk but which constructs drive that risk. Recent educational applications confirm this combination. Choi, Choi, Lam and Mendes (2026) integrated an optimised XGBoost classifier with SHAP on a major learning analytics dataset, generating individualised reports for students. Academic achievement and dropout studies in higher education have similarly demonstrated that interpretable gradient boosted models can support timely intervention (PLOS ONE, 2024; Emerging Science Journal, 2025). The present study applies this approach specifically to cybersecurity behavioural readiness, adapting </w:t>
-      </w:r>
-      <w:r>
         <w:lastRenderedPageBreak/>
         <w:t>it to the KAB framework and adding a theoretically derived cost sensitive weighting that has not previously been applied in this context.</w:t>
       </w:r>
@@ -128,8 +124,6 @@
       </w:pPr>
       <w:r>
         <w:t xml:space="preserve">The third problem is data quality. Recent research has shown that online and incentivised surveys are increasingly vulnerable to duplicate and fraudulent responses that can severely distort machine learning results. When duplicate rows are present in a dataset used for model training, tree based classifiers can memorise them rather than </w:t>
-      </w:r>
-      <w:r>
         <w:lastRenderedPageBreak/>
         <w:t>learning the underlying pattern, producing performance figures that collapse once the data are cleaned (Frontiers in Research Metrics and Analytics, 2024; Gordon, Fujinaga-Gordon, &amp; Sherwin, 2024). The primary dataset used in the present study was collected on printed questionnaires and entered digitally, and an examination of the raw export revealed a substantial proportion of exact duplicate response patterns. These were identified and removed before modelling, but the process and its consequences must be reported transparently, both to protect the validity of the results and to contribute to the growing literature on data quality in survey based research.</w:t>
       </w:r>
@@ -212,8 +206,6 @@
       </w:pPr>
       <w:r>
         <w:t xml:space="preserve">1. Does the Knowledge-Attitude asymmetry weighting in KAB-XGBoost-WCE produce a statistically significant improvement in macro F1 over an unweighted </w:t>
-      </w:r>
-      <w:r>
         <w:lastRenderedPageBreak/>
         <w:t>baseline XGBoost and over a stock class-weighted XGBoost on the de-duplicated KNUST dataset?</w:t>
       </w:r>
@@ -285,8 +277,6 @@
       </w:pPr>
       <w:r>
         <w:t xml:space="preserve">The study is bounded in three ways. Geographically, the primary data come from one department, Supply Chain Management, at one university, KNUST, in Ghana. This scope was chosen deliberately to ensure that the model is trained on a coherent </w:t>
-      </w:r>
-      <w:r>
         <w:lastRenderedPageBreak/>
         <w:t>institutional population rather than a heterogeneous aggregate, but it means the fitted model is specific to that population and cannot be assumed to generalise without retraining. The external Alzubaidi (2021) dataset is used only as a structurally distinct stress test to probe whether the weighting mechanism behaves sensibly on a different population; it is not treated as an independent replication, and no cross-population performance claim is made. Methodologically, the study uses self reported questionnaire data and therefore targets self reported behavioural readiness rather than directly observed behaviour. No claim is made about the model's ability to predict actual security incidents.</w:t>
       </w:r>
@@ -501,8 +491,6 @@
       </w:pPr>
       <w:r>
         <w:t xml:space="preserve">University students represent a population of particular interest to cybersecurity awareness researchers because they combine high digital usage with limited formal security training, significant financial activity through mobile money and e-banking, and social media habits that create broad attack surfaces for phishing and social engineering. Recent work has characterised their readiness in several complementary ways, consistently finding that neither knowledge levels nor attitude alone is sufficient </w:t>
-      </w:r>
-      <w:r>
         <w:lastRenderedPageBreak/>
         <w:t>to explain behaviour, and that the relationship between constructs is more complex than a simple additive model would suggest.</w:t>
       </w:r>
@@ -532,8 +520,6 @@
       </w:pPr>
       <w:r>
         <w:t xml:space="preserve">A cybersecurity resilience gap study (arXiv, 2024) introduced a useful framing for the kind of within-individual inconsistency the KAB model captures. Examining student attitudes and behaviours in higher education settings, the study documented a pattern in which students expressed confidence in their ability to manage cyber risk while </w:t>
-      </w:r>
-      <w:r>
         <w:lastRenderedPageBreak/>
         <w:t>simultaneously exhibiting measurable vulnerability in their actual practices, particularly around phishing recognition. This confident but vulnerable profile is precisely the population segment that a Knowledge-Attitude asymmetry weighting function is designed to flag: a high knowledge score combined with a low attitude score should, under the KAB theoretical model, predict fragile behaviour, and the weighting function increases the cost of misclassifying such students during training.</w:t>
       </w:r>
@@ -577,8 +563,6 @@
       </w:pPr>
       <w:r>
         <w:t xml:space="preserve">A dropout prediction study of MENA STEM students at a UAE university applied XGBoost with SHAP and found that withdrawn semesters, probation history and second term performance were the strongest predictors, with SHAP summary plots clearly revealing not just which features mattered but in which direction and for which students they pushed the prediction (Emerging Science Journal, 2025). This study is directly relevant to the present work because it demonstrates that the XGBoost-SHAP pipeline can be operationalised in an institution serving a population comparable to KNUST in its development context and student demographic profile. The OULAD </w:t>
-      </w:r>
-      <w:r>
         <w:lastRenderedPageBreak/>
         <w:t>study by Choi, Choi, Lam and Mendes (2026) went further by not only predicting performance but generating individualised feedback reports from SHAP explanations, showing that the interpretability output of the pipeline can be directly actionable at the student level rather than only informative at the population level.</w:t>
       </w:r>
@@ -702,8 +686,6 @@
       </w:pPr>
       <w:r>
         <w:t xml:space="preserve">A practical introduction to SHAP for interpreting XGBoost classification models applied to health data highlighted precisely this dual capacity and argued that SHAP is increasingly expected by clinicians, policymakers and journal reviewers as a minimum standard of interpretability for applied gradient boosting models (Subianto, 2025). The phishing detection and network security literature has similarly adopted SHAP as a standard complement to XGBoost, using it to confirm that the most discriminative features align with domain knowledge and to build trust in model outputs among practitioners (Kytidou et al., 2025; XGBoost-based IDS for IoT, 2026). The present study follows this practice, using SHAP to test the theoretical prediction of the KAB </w:t>
-      </w:r>
-      <w:r>
         <w:lastRenderedPageBreak/>
         <w:t>framework that Knowledge and Attitude aggregates should rank as the most influential features, and reporting both global rankings and the directional interpretation.</w:t>
       </w:r>
@@ -755,8 +737,6 @@
       </w:pPr>
       <w:r>
         <w:t xml:space="preserve">Class imbalance, the condition in which one class is substantially less frequent than the other, has been extensively studied in machine learning because standard classifiers optimise for overall accuracy, which is dominated by the majority class. The effects are most acute in security related classification tasks, where the minority class, an attack, a fraudulent transaction, or a low readiness student, is simultaneously the class of greatest </w:t>
-      </w:r>
-      <w:r>
         <w:lastRenderedPageBreak/>
         <w:t>practical interest and the hardest to classify correctly under a standard training objective. The established remedies fall into two families: data level approaches that resample or synthesise minority class instances, and algorithm level approaches that modify the loss function or introduce asymmetric misclassification costs. Cost sensitive learning belongs to the second family and is generally preferred for structured tabular data because it does not distort the empirical distribution of the training set.</w:t>
       </w:r>
@@ -777,8 +757,6 @@
       </w:pPr>
       <w:r>
         <w:t xml:space="preserve">The hybrid XGBoost models for intrusion detection that have appeared recently, combining cost sensitive weighting with transformer architectures or variational autoencoders, confirm that algorithm level cost sensitivity can be effectively engineered on top of XGBoost while retaining its interpretability advantages (Zhou, Zhu, &amp; Cheng, 2026; XGBoost-IDS for IoT, 2026). Comparative studies have found that the optimal balance between data level and algorithm level approaches depends on the feature selection method and the specific dataset structure, underlining that no single remedy dominates across all contexts and that empirical ablation is necessary to attribute performance gains correctly (Springer LNCS, 2025). This finding directly motivates the four arm ablation design in the present study, which isolates the contribution of depth </w:t>
-      </w:r>
-      <w:r>
         <w:lastRenderedPageBreak/>
         <w:t>tuning from the contribution of the KAB weighting so that the two sources of gain are not confounded.</w:t>
       </w:r>
@@ -870,8 +848,6 @@
       </w:pPr>
       <w:r>
         <w:t xml:space="preserve">A systematic analysis of thirty one fraud detection strategies applied to online surveys found that a large proportion of openly distributed responses were verifiably fraudulent, and proposed precision and recall based scoring to evaluate individual detection indicators (Frontiers in Research Metrics and Analytics, 2024). An MTurk sample study found that an estimated 65 to 84 percent of compensation seeking responses were fraudulent, with survey re-entry, duplicate demographic data and similar open ended responses as the leading signatures, and that several commonly recommended best practices, including screening questions and system qualification requirements, were individually insufficient to prevent the contamination (International Journal of Social Research Methodology, 2025). A comprehensive tutorial for researchers treated every response as potentially fraudulent until screened, and recommended layered detection </w:t>
-      </w:r>
-      <w:r>
         <w:lastRenderedPageBreak/>
         <w:t>combining multiple indicators because no single check was robust alone (PubMed, 2025). The impact is most severe in small or specific target populations, where even a modest number of fraudulent or duplicated entries represents a large proportion of the sample and disproportionately distorts results (Gordon, Fujinaga-Gordon, &amp; Sherwin, 2024).</w:t>
       </w:r>
@@ -914,7 +890,7 @@
         <w:jc w:val="both"/>
       </w:pPr>
       <w:r>
-        <w:t>Table 2.1 presents a structured comparison of the twenty most closely related published studies, selected to represent each of the major thematic areas covered in this chapter. The studies are drawn predominantly from 2024 to 2026 in line with the recency criterion for this review. The comparison evaluates each study against five dimensions: the construct being measured or predicted, the method employed, the context, what the study contributes, and the gap that the present study fills.</w:t>
+        <w:t>Table 2.1 presents a structured comparison of the twenty most closely related published studies, selected to represent each of the major thematic areas covered in this chapter. The studies are drawn predominantly from 2024 to 2026 . The comparison evaluates each study against five dimensions: the construct being measured or predicted, the method employed, the context, what the study contributes, and the gap that the present study fills.</w:t>
       </w:r>
     </w:p>
     <w:p>
@@ -1706,11 +1682,6 @@
                 <w:sz w:val="18"/>
               </w:rPr>
               <w:t xml:space="preserve">Transformer + XGBoost, cost </w:t>
-            </w:r>
-            <w:r>
-              <w:rPr>
-                <w:sz w:val="18"/>
-              </w:rPr>
               <w:lastRenderedPageBreak/>
               <w:t>weighting</w:t>
             </w:r>
@@ -1740,11 +1711,6 @@
                 <w:sz w:val="18"/>
               </w:rPr>
               <w:t xml:space="preserve">Inverse-frequency weighting; not </w:t>
-            </w:r>
-            <w:r>
-              <w:rPr>
-                <w:sz w:val="18"/>
-              </w:rPr>
               <w:lastRenderedPageBreak/>
               <w:t>theory-derived</w:t>
             </w:r>
@@ -2448,11 +2414,6 @@
                 <w:sz w:val="18"/>
               </w:rPr>
               <w:t xml:space="preserve">Population level insight; no institutional </w:t>
-            </w:r>
-            <w:r>
-              <w:rPr>
-                <w:sz w:val="18"/>
-              </w:rPr>
               <w:lastRenderedPageBreak/>
               <w:t>prediction</w:t>
             </w:r>
@@ -3211,8 +3172,6 @@
       </w:pPr>
       <w:r>
         <w:t xml:space="preserve">The literature reviewed across Sections 2.1 to 2.7 supports the following synthesis. Cybersecurity awareness among university students is a well documented but incompletely addressed problem. The KAB framework provides a psychometrically grounded structure for measurement, and the knowing-doing gap between knowledge and behaviour is one of the most consistent empirical findings in the field. Machine learning, specifically XGBoost with SHAP, is a mature and reliable approach to prediction and interpretation on structured educational data, but has not been applied to KAB structured cybersecurity readiness. Cost sensitive learning, including per instance weighting, has proven effective in network </w:t>
-      </w:r>
-      <w:r>
         <w:lastRenderedPageBreak/>
         <w:t>security but has not been grounded in psychometric theory or applied to survey based behavioural classification. Survey data quality is a growing concern that has potentially severe consequences for tree based machine learning models, but the machine learning literature has not adequately integrated it. Taken together, these four observations define the space the present study occupies and the contribution it makes.</w:t>
       </w:r>
@@ -3256,8 +3215,6 @@
       </w:pPr>
       <w:r>
         <w:t xml:space="preserve">Protection Motivation Theory (Rogers, 1975) distinguishes between threat appraisal, a person's assessment of the severity and likelihood of a threat, and coping appraisal, their assessment of their own ability to respond effectively. The Knowledge items in the KNUST instrument assess threat recognition and coping knowledge, while the Attitude items assess evaluative stances toward protective practices. Together the two constructs map onto the two appraisal components of PMT, and their divergence has a clear theoretical interpretation: a student who recognises threats but does not value protective practices is high on threat appraisal but low on coping motivation, a combination that PMT predicts will produce avoidance rather than protection. Jamil, Zia, Nayeem, Whitty and D'Alessandro (2025) applied PMT to micro business owners' security behaviour and found that coping appraisal, particularly self efficacy and response efficacy, was more strongly </w:t>
-      </w:r>
-      <w:r>
         <w:lastRenderedPageBreak/>
         <w:t>associated with protective behaviour than threat severity alone, supporting the view that motivational alignment, rather than knowledge alone, is the proximate driver of secure action.</w:t>
       </w:r>
@@ -3389,8 +3346,6 @@
       </w:pPr>
       <w:r>
         <w:t xml:space="preserve">This chapter has reviewed the literature on cybersecurity awareness and its evolution, the concept of behavioural readiness in students, machine learning and SHAP explainability for prediction, student engagement and outcomes, cost sensitive and instance level learning, learning analytics data quality and survey integrity, and the theoretical frameworks grounding the study. It has presented a structured comparative review of twenty closely related studies published predominantly between 2024 and 2026, documenting in each case what the study contributes and the gap it leaves that the present study addresses. The </w:t>
-      </w:r>
-      <w:r>
         <w:lastRenderedPageBreak/>
         <w:t>chapter has shown that while each component of the proposed pipeline is individually well established in recent literature, no prior study combines a validated KAB instrument, a Knowledge-Attitude asymmetry weighting function, XGBoost with SHAP explainability, and a transparent duplicate de-duplication procedure within a single pipeline applied to a Ghanaian higher education population. This combination, together with the honest reporting of a null-to-negative primary result, constitutes the specific contribution of the study. The theoretical grounding in the Theory of Planned Behaviour and Protection Motivation Theory, and the three layer measurement, prediction and explanation conceptual framework, will be operationalised in the methodology presented in the next chapter.</w:t>
       </w:r>
@@ -3419,7 +3374,7 @@
           <w:i/>
           <w:sz w:val="20"/>
         </w:rPr>
-        <w:t>All sources were verified against a live publisher, journal or repository record at the time of writing. Entries dated 2024 to 2026 are primary sources verified through current search results. Four foundational theory and method anchors (Ajzen 1991; Rogers 1975; Chen and Guestrin 2016; Lundberg and Lee 2017) are included as unavoidable origin citations for the frameworks and algorithms used.</w:t>
+        <w:t/>
       </w:r>
     </w:p>
     <w:p>

</xml_diff>